<commit_message>
docs: mise à jour documentation v1.1 (prof + élève + README)
- README : réécriture complète — 14 types d'objectifs, 7 pannes, 3 scénarios JSON, 128 tests
- doc-prof : ajout des 5 nouveaux types d'objectifs (wifi_link, ssid_configured, device_added,
  route_exists, dns_record), section Mode panne, section Scénarios prêts à l'emploi, Box WiFi
- doc-eleve : onglet Activité toujours visible (plus panneau de droite), suppression
  "Objectif verrouillé", ajout WiFi dans le dépannage
- PDF + DOCX régénérés pour les deux guides

Co-Authored-By: Claude Sonnet 4.6 <noreply@anthropic.com>
</commit_message>
<xml_diff>
--- a/doc-eleve.docx
+++ b/doc-eleve.docx
@@ -4,30 +4,31 @@
   <w:body>
     <w:p>
       <w:pPr>
-        <w:spacing w:before="1600"/>
         <w:jc w:val="center"/>
       </w:pPr>
       <w:r>
         <w:rPr>
           <w:b/>
-          <w:color w:val="1A202C"/>
-          <w:sz w:val="52"/>
+          <w:color w:val="1A2F1A"/>
+          <w:sz w:val="72"/>
         </w:rPr>
         <w:t>Guide Élève</w:t>
       </w:r>
     </w:p>
+    <w:p/>
     <w:p>
       <w:pPr>
         <w:jc w:val="center"/>
       </w:pPr>
       <w:r>
         <w:rPr>
-          <w:color w:val="2B6CB0"/>
+          <w:color w:val="4A5568"/>
           <w:sz w:val="28"/>
         </w:rPr>
         <w:t>Simulateur Réseau IPv4</w:t>
       </w:r>
     </w:p>
+    <w:p/>
     <w:p>
       <w:pPr>
         <w:jc w:val="center"/>
@@ -35,12 +36,43 @@
       <w:r>
         <w:rPr>
           <w:i/>
-          <w:color w:val="718096"/>
+          <w:color w:val="4A5568"/>
           <w:sz w:val="22"/>
         </w:rPr>
-        <w:t>Apprendre les réseaux en simulant les protocoles TCP/IP</w:t>
+        <w:t>Guide élève v1.1</w:t>
       </w:r>
     </w:p>
+    <w:p/>
+    <w:tbl>
+      <w:tblPr>
+        <w:tblW w:type="auto" w:w="0"/>
+        <w:tblLook w:firstColumn="1" w:firstRow="1" w:lastColumn="0" w:lastRow="0" w:noHBand="0" w:noVBand="1" w:val="04A0"/>
+      </w:tblPr>
+      <w:tblGrid>
+        <w:gridCol w:w="9406"/>
+      </w:tblGrid>
+      <w:tr>
+        <w:tc>
+          <w:tcPr>
+            <w:tcW w:type="dxa" w:w="9406"/>
+            <w:shd w:fill="2F855A" w:color="auto" w:val="clear"/>
+          </w:tcPr>
+          <w:p>
+            <w:pPr>
+              <w:jc w:val="center"/>
+            </w:pPr>
+            <w:r>
+              <w:rPr>
+                <w:b/>
+                <w:color w:val="FFFFFF"/>
+                <w:sz w:val="22"/>
+              </w:rPr>
+              <w:t xml:space="preserve">  Mode Simulation  </w:t>
+            </w:r>
+          </w:p>
+        </w:tc>
+      </w:tr>
+    </w:tbl>
     <w:p>
       <w:r>
         <w:br w:type="page"/>
@@ -49,125 +81,229 @@
     <w:p>
       <w:pPr>
         <w:pStyle w:val="Heading1"/>
-        <w:jc w:val="left"/>
+        <w:keepNext/>
+        <w:spacing w:before="360" w:after="160"/>
       </w:pPr>
       <w:r>
         <w:rPr>
-          <w:color w:val="1A202C"/>
+          <w:b/>
+          <w:color w:val="1A2F1A"/>
+          <w:sz w:val="28"/>
         </w:rPr>
         <w:t>1. Prise en main du simulateur</w:t>
       </w:r>
     </w:p>
     <w:p>
       <w:pPr>
-        <w:jc w:val="center"/>
+        <w:spacing w:after="120"/>
       </w:pPr>
       <w:r>
-        <w:drawing>
-          <wp:inline xmlns:a="http://schemas.openxmlformats.org/drawingml/2006/main" xmlns:pic="http://schemas.openxmlformats.org/drawingml/2006/picture">
-            <wp:extent cx="5040000" cy="2908587"/>
-            <wp:docPr id="1" name="Picture 1"/>
-            <wp:cNvGraphicFramePr>
-              <a:graphicFrameLocks noChangeAspect="1"/>
-            </wp:cNvGraphicFramePr>
-            <a:graphic>
-              <a:graphicData uri="http://schemas.openxmlformats.org/drawingml/2006/picture">
-                <pic:pic>
-                  <pic:nvPicPr>
-                    <pic:cNvPr id="0" name="mock_student.png"/>
-                    <pic:cNvPicPr/>
-                  </pic:nvPicPr>
-                  <pic:blipFill>
-                    <a:blip r:embed="rId9"/>
-                    <a:stretch>
-                      <a:fillRect/>
-                    </a:stretch>
-                  </pic:blipFill>
-                  <pic:spPr>
-                    <a:xfrm>
-                      <a:off x="0" y="0"/>
-                      <a:ext cx="5040000" cy="2908587"/>
-                    </a:xfrm>
-                    <a:prstGeom prst="rect"/>
-                  </pic:spPr>
-                </pic:pic>
-              </a:graphicData>
-            </a:graphic>
-          </wp:inline>
-        </w:drawing>
+        <w:rPr>
+          <w:b w:val="0"/>
+          <w:sz w:val="19"/>
+        </w:rPr>
+        <w:t xml:space="preserve">Le simulateur se compose de trois zones principales : le </w:t>
+      </w:r>
+      <w:r>
+        <w:rPr>
+          <w:b/>
+          <w:sz w:val="19"/>
+        </w:rPr>
+        <w:t>canevas réseau</w:t>
+      </w:r>
+      <w:r>
+        <w:rPr>
+          <w:b w:val="0"/>
+          <w:sz w:val="19"/>
+        </w:rPr>
+        <w:t xml:space="preserve"> (centre) où vous voyez les appareils et les câbles, le </w:t>
+      </w:r>
+      <w:r>
+        <w:rPr>
+          <w:b/>
+          <w:sz w:val="19"/>
+        </w:rPr>
+        <w:t>panneau de propriétés</w:t>
+      </w:r>
+      <w:r>
+        <w:rPr>
+          <w:b w:val="0"/>
+          <w:sz w:val="19"/>
+        </w:rPr>
+        <w:t xml:space="preserve"> (droite, en mode Configuration) pour configurer les appareils, et l'</w:t>
+      </w:r>
+      <w:r>
+        <w:rPr>
+          <w:b/>
+          <w:sz w:val="19"/>
+        </w:rPr>
+        <w:t>onglet 📋 Activité</w:t>
+      </w:r>
+      <w:r>
+        <w:rPr>
+          <w:b w:val="0"/>
+          <w:sz w:val="19"/>
+        </w:rPr>
+        <w:t xml:space="preserve"> (bas, toujours visible) qui affiche vos objectifs et votre progression.</w:t>
       </w:r>
     </w:p>
     <w:p>
       <w:pPr>
-        <w:jc w:val="center"/>
+        <w:pStyle w:val="Heading2"/>
+        <w:keepNext/>
+        <w:spacing w:before="240" w:after="120"/>
       </w:pPr>
       <w:r>
         <w:rPr>
-          <w:i/>
-          <w:color w:val="718096"/>
-          <w:sz w:val="16"/>
+          <w:b/>
+          <w:color w:val="2F855A"/>
+          <w:sz w:val="22"/>
         </w:rPr>
-      </w:r>
-      <w:r>
-        <w:t>Interface du simulateur : canevas réseau, terminal, objectifs et score.</w:t>
-      </w:r>
-    </w:p>
-    <w:p>
-      <w:r>
-        <w:t>Le simulateur se compose de trois zones : le canevas réseau (centre) où vous voyez les appareils, le terminal (bas) où vous tapez les commandes, et le panneau d'objectifs (droite) qui affiche votre progression.</w:t>
+        <w:t>Les deux modes :</w:t>
       </w:r>
     </w:p>
     <w:p>
       <w:pPr>
-        <w:spacing w:before="80" w:after="120"/>
-        <w:ind w:left="283" w:right="283"/>
+        <w:pStyle w:val="ListBullet"/>
+        <w:spacing w:after="80"/>
       </w:pPr>
       <w:r>
         <w:rPr>
-          <w:color w:val="744210"/>
-          <w:sz w:val="18"/>
+          <w:b/>
+          <w:sz w:val="19"/>
         </w:rPr>
-        <w:t>⚠️ En mode Simulation, vous ne pouvez plus modifier le réseau. Repassez en mode Configuration pour câbler ou configurer les appareils.</w:t>
+        <w:t>Mode Configuration</w:t>
+      </w:r>
+      <w:r>
+        <w:rPr>
+          <w:b w:val="0"/>
+          <w:sz w:val="19"/>
+        </w:rPr>
+        <w:t xml:space="preserve"> — Vous pouvez modifier le réseau : ajouter des appareils, câbler, configurer les adresses IP dans le panneau de droite.</w:t>
       </w:r>
     </w:p>
     <w:p>
       <w:pPr>
-        <w:pStyle w:val="Heading1"/>
-        <w:jc w:val="left"/>
+        <w:pStyle w:val="ListBullet"/>
+        <w:spacing w:after="80"/>
       </w:pPr>
       <w:r>
         <w:rPr>
-          <w:color w:val="1A202C"/>
+          <w:b/>
+          <w:sz w:val="19"/>
         </w:rPr>
-        <w:t>2. Commandes disponibles dans le terminal</w:t>
+        <w:t>Mode Simulation</w:t>
+      </w:r>
+      <w:r>
+        <w:rPr>
+          <w:b w:val="0"/>
+          <w:sz w:val="19"/>
+        </w:rPr>
+        <w:t xml:space="preserve"> — Les appareils sont "sous tension". Cliquez sur un appareil pour ouvrir son terminal et lancer des commandes réseau.</w:t>
+      </w:r>
+    </w:p>
+    <w:tbl>
+      <w:tblPr>
+        <w:tblW w:type="auto" w:w="0"/>
+        <w:jc w:val="left"/>
+        <w:tblLook w:firstColumn="1" w:firstRow="1" w:lastColumn="0" w:lastRow="0" w:noHBand="0" w:noVBand="1" w:val="04A0"/>
+      </w:tblPr>
+      <w:tblGrid>
+        <w:gridCol w:w="9406"/>
+      </w:tblGrid>
+      <w:tr>
+        <w:tc>
+          <w:tcPr>
+            <w:tcW w:type="dxa" w:w="9406"/>
+            <w:shd w:fill="FFF5F5" w:color="auto" w:val="clear"/>
+            <w:tcMar>
+              <w:top w:w="100" w:type="dxa"/>
+              <w:bottom w:w="100" w:type="dxa"/>
+              <w:left w:w="100" w:type="dxa"/>
+              <w:right w:w="100" w:type="dxa"/>
+            </w:tcMar>
+          </w:tcPr>
+          <w:p>
+            <w:r>
+              <w:rPr>
+                <w:b w:val="0"/>
+                <w:sz w:val="18"/>
+              </w:rPr>
+              <w:t>⚠  Attention : En mode Simulation, vous ne pouvez plus modifier le réseau. Repassez en mode Configuration pour ajouter ou câbler des appareils.</w:t>
+            </w:r>
+          </w:p>
+        </w:tc>
+      </w:tr>
+    </w:tbl>
+    <w:p/>
+    <w:p>
+      <w:pPr>
+        <w:pStyle w:val="Heading1"/>
+        <w:keepNext/>
+        <w:spacing w:before="360" w:after="160"/>
+      </w:pPr>
+      <w:r>
+        <w:rPr>
+          <w:b/>
+          <w:color w:val="1A2F1A"/>
+          <w:sz w:val="28"/>
+        </w:rPr>
+        <w:t>2. Le terminal — commandes disponibles</w:t>
       </w:r>
     </w:p>
     <w:p>
+      <w:pPr>
+        <w:spacing w:after="120"/>
+      </w:pPr>
       <w:r>
-        <w:t>En mode Simulation, cliquez sur un PC ou Serveur pour ouvrir son terminal. Tapez la commande et appuyez sur Entrée. Utilisez ↑ / ↓ pour naviguer dans l'historique.</w:t>
+        <w:rPr>
+          <w:b w:val="0"/>
+          <w:sz w:val="19"/>
+        </w:rPr>
+        <w:t xml:space="preserve">En mode Simulation, cliquez sur n'importe quel PC ou Serveur pour ouvrir son terminal. Tapez vos commandes et appuyez sur </w:t>
+      </w:r>
+      <w:r>
+        <w:rPr>
+          <w:b/>
+          <w:sz w:val="19"/>
+        </w:rPr>
+        <w:t>Entrée</w:t>
+      </w:r>
+      <w:r>
+        <w:rPr>
+          <w:b w:val="0"/>
+          <w:sz w:val="19"/>
+        </w:rPr>
+        <w:t>. Utilisez ↑ / ↓ pour retrouver les commandes précédentes.</w:t>
       </w:r>
     </w:p>
     <w:tbl>
       <w:tblPr>
         <w:tblStyle w:val="TableGrid"/>
         <w:tblW w:type="auto" w:w="0"/>
+        <w:jc w:val="left"/>
         <w:tblLook w:firstColumn="1" w:firstRow="1" w:lastColumn="0" w:lastRow="0" w:noHBand="0" w:noVBand="1" w:val="04A0"/>
       </w:tblPr>
       <w:tblGrid>
-        <w:gridCol w:w="4320"/>
-        <w:gridCol w:w="4320"/>
+        <w:gridCol w:w="3135"/>
+        <w:gridCol w:w="3135"/>
+        <w:gridCol w:w="3135"/>
       </w:tblGrid>
       <w:tr>
         <w:tc>
           <w:tcPr>
-            <w:tcW w:type="dxa" w:w="4320"/>
-            <w:shd w:val="clear" w:color="auto" w:fill="1a202c"/>
+            <w:tcW w:type="dxa" w:w="1587"/>
+            <w:shd w:fill="1A365D" w:color="auto" w:val="clear"/>
           </w:tcPr>
           <w:p>
+            <w:pPr>
+              <w:spacing w:after="60"/>
+            </w:pPr>
             <w:r>
               <w:rPr>
                 <w:b/>
                 <w:color w:val="FFFFFF"/>
+                <w:sz w:val="17"/>
               </w:rPr>
               <w:t>Commande</w:t>
             </w:r>
@@ -175,14 +311,705 @@
         </w:tc>
         <w:tc>
           <w:tcPr>
-            <w:tcW w:type="dxa" w:w="4320"/>
-            <w:shd w:val="clear" w:color="auto" w:fill="1a202c"/>
+            <w:tcW w:type="dxa" w:w="4082"/>
+            <w:shd w:fill="1A365D" w:color="auto" w:val="clear"/>
           </w:tcPr>
           <w:p>
+            <w:pPr>
+              <w:spacing w:after="60"/>
+            </w:pPr>
             <w:r>
               <w:rPr>
                 <w:b/>
                 <w:color w:val="FFFFFF"/>
+                <w:sz w:val="17"/>
+              </w:rPr>
+              <w:t>Description</w:t>
+            </w:r>
+          </w:p>
+        </w:tc>
+        <w:tc>
+          <w:tcPr>
+            <w:tcW w:type="dxa" w:w="3855"/>
+            <w:shd w:fill="1A365D" w:color="auto" w:val="clear"/>
+          </w:tcPr>
+          <w:p>
+            <w:pPr>
+              <w:spacing w:after="60"/>
+            </w:pPr>
+            <w:r>
+              <w:rPr>
+                <w:b/>
+                <w:color w:val="FFFFFF"/>
+                <w:sz w:val="17"/>
+              </w:rPr>
+              <w:t>Exemple</w:t>
+            </w:r>
+          </w:p>
+        </w:tc>
+      </w:tr>
+      <w:tr>
+        <w:tc>
+          <w:tcPr>
+            <w:tcW w:type="dxa" w:w="1587"/>
+            <w:shd w:fill="FFFFFF" w:color="auto" w:val="clear"/>
+          </w:tcPr>
+          <w:p>
+            <w:pPr>
+              <w:spacing w:after="40"/>
+            </w:pPr>
+            <w:r>
+              <w:rPr>
+                <w:rFonts w:ascii="Courier New" w:hAnsi="Courier New"/>
+                <w:sz w:val="17"/>
+              </w:rPr>
+              <w:t>ping</w:t>
+            </w:r>
+          </w:p>
+        </w:tc>
+        <w:tc>
+          <w:tcPr>
+            <w:tcW w:type="dxa" w:w="4082"/>
+            <w:shd w:fill="FFFFFF" w:color="auto" w:val="clear"/>
+          </w:tcPr>
+          <w:p>
+            <w:pPr>
+              <w:spacing w:after="40"/>
+            </w:pPr>
+            <w:r>
+              <w:rPr>
+                <w:sz w:val="17"/>
+              </w:rPr>
+              <w:t>Envoie un ping vers une IP ou un nom.</w:t>
+            </w:r>
+          </w:p>
+        </w:tc>
+        <w:tc>
+          <w:tcPr>
+            <w:tcW w:type="dxa" w:w="3855"/>
+            <w:shd w:fill="FFFFFF" w:color="auto" w:val="clear"/>
+          </w:tcPr>
+          <w:p>
+            <w:pPr>
+              <w:spacing w:after="40"/>
+            </w:pPr>
+            <w:r>
+              <w:rPr>
+                <w:rFonts w:ascii="Courier New" w:hAnsi="Courier New"/>
+                <w:sz w:val="17"/>
+              </w:rPr>
+              <w:t>ping 192.168.1.1</w:t>
+              <w:br/>
+              <w:t>ping serveur.local</w:t>
+            </w:r>
+          </w:p>
+        </w:tc>
+      </w:tr>
+      <w:tr>
+        <w:tc>
+          <w:tcPr>
+            <w:tcW w:type="dxa" w:w="1587"/>
+            <w:shd w:fill="F0F4F8" w:color="auto" w:val="clear"/>
+          </w:tcPr>
+          <w:p>
+            <w:pPr>
+              <w:spacing w:after="40"/>
+            </w:pPr>
+            <w:r>
+              <w:rPr>
+                <w:rFonts w:ascii="Courier New" w:hAnsi="Courier New"/>
+                <w:sz w:val="17"/>
+              </w:rPr>
+              <w:t>nslookup</w:t>
+            </w:r>
+          </w:p>
+        </w:tc>
+        <w:tc>
+          <w:tcPr>
+            <w:tcW w:type="dxa" w:w="4082"/>
+            <w:shd w:fill="F0F4F8" w:color="auto" w:val="clear"/>
+          </w:tcPr>
+          <w:p>
+            <w:pPr>
+              <w:spacing w:after="40"/>
+            </w:pPr>
+            <w:r>
+              <w:rPr>
+                <w:sz w:val="17"/>
+              </w:rPr>
+              <w:t>Résout un nom de domaine en adresse IP.</w:t>
+            </w:r>
+          </w:p>
+        </w:tc>
+        <w:tc>
+          <w:tcPr>
+            <w:tcW w:type="dxa" w:w="3855"/>
+            <w:shd w:fill="F0F4F8" w:color="auto" w:val="clear"/>
+          </w:tcPr>
+          <w:p>
+            <w:pPr>
+              <w:spacing w:after="40"/>
+            </w:pPr>
+            <w:r>
+              <w:rPr>
+                <w:rFonts w:ascii="Courier New" w:hAnsi="Courier New"/>
+                <w:sz w:val="17"/>
+              </w:rPr>
+              <w:t>nslookup web.ecole.fr</w:t>
+            </w:r>
+          </w:p>
+        </w:tc>
+      </w:tr>
+      <w:tr>
+        <w:tc>
+          <w:tcPr>
+            <w:tcW w:type="dxa" w:w="1587"/>
+            <w:shd w:fill="FFFFFF" w:color="auto" w:val="clear"/>
+          </w:tcPr>
+          <w:p>
+            <w:pPr>
+              <w:spacing w:after="40"/>
+            </w:pPr>
+            <w:r>
+              <w:rPr>
+                <w:rFonts w:ascii="Courier New" w:hAnsi="Courier New"/>
+                <w:sz w:val="17"/>
+              </w:rPr>
+              <w:t>http</w:t>
+            </w:r>
+          </w:p>
+        </w:tc>
+        <w:tc>
+          <w:tcPr>
+            <w:tcW w:type="dxa" w:w="4082"/>
+            <w:shd w:fill="FFFFFF" w:color="auto" w:val="clear"/>
+          </w:tcPr>
+          <w:p>
+            <w:pPr>
+              <w:spacing w:after="40"/>
+            </w:pPr>
+            <w:r>
+              <w:rPr>
+                <w:sz w:val="17"/>
+              </w:rPr>
+              <w:t>Accède à une page web par IP ou URL.</w:t>
+            </w:r>
+          </w:p>
+        </w:tc>
+        <w:tc>
+          <w:tcPr>
+            <w:tcW w:type="dxa" w:w="3855"/>
+            <w:shd w:fill="FFFFFF" w:color="auto" w:val="clear"/>
+          </w:tcPr>
+          <w:p>
+            <w:pPr>
+              <w:spacing w:after="40"/>
+            </w:pPr>
+            <w:r>
+              <w:rPr>
+                <w:rFonts w:ascii="Courier New" w:hAnsi="Courier New"/>
+                <w:sz w:val="17"/>
+              </w:rPr>
+              <w:t>http 192.168.1.1</w:t>
+              <w:br/>
+              <w:t>http web.ecole.fr</w:t>
+            </w:r>
+          </w:p>
+        </w:tc>
+      </w:tr>
+      <w:tr>
+        <w:tc>
+          <w:tcPr>
+            <w:tcW w:type="dxa" w:w="1587"/>
+            <w:shd w:fill="F0F4F8" w:color="auto" w:val="clear"/>
+          </w:tcPr>
+          <w:p>
+            <w:pPr>
+              <w:spacing w:after="40"/>
+            </w:pPr>
+            <w:r>
+              <w:rPr>
+                <w:rFonts w:ascii="Courier New" w:hAnsi="Courier New"/>
+                <w:sz w:val="17"/>
+              </w:rPr>
+              <w:t>dhcp</w:t>
+            </w:r>
+          </w:p>
+        </w:tc>
+        <w:tc>
+          <w:tcPr>
+            <w:tcW w:type="dxa" w:w="4082"/>
+            <w:shd w:fill="F0F4F8" w:color="auto" w:val="clear"/>
+          </w:tcPr>
+          <w:p>
+            <w:pPr>
+              <w:spacing w:after="40"/>
+            </w:pPr>
+            <w:r>
+              <w:rPr>
+                <w:sz w:val="17"/>
+              </w:rPr>
+              <w:t>Demande une adresse IP automatiquement.</w:t>
+            </w:r>
+          </w:p>
+        </w:tc>
+        <w:tc>
+          <w:tcPr>
+            <w:tcW w:type="dxa" w:w="3855"/>
+            <w:shd w:fill="F0F4F8" w:color="auto" w:val="clear"/>
+          </w:tcPr>
+          <w:p>
+            <w:pPr>
+              <w:spacing w:after="40"/>
+            </w:pPr>
+            <w:r>
+              <w:rPr>
+                <w:rFonts w:ascii="Courier New" w:hAnsi="Courier New"/>
+                <w:sz w:val="17"/>
+              </w:rPr>
+              <w:t>dhcp</w:t>
+            </w:r>
+          </w:p>
+        </w:tc>
+      </w:tr>
+      <w:tr>
+        <w:tc>
+          <w:tcPr>
+            <w:tcW w:type="dxa" w:w="1587"/>
+            <w:shd w:fill="FFFFFF" w:color="auto" w:val="clear"/>
+          </w:tcPr>
+          <w:p>
+            <w:pPr>
+              <w:spacing w:after="40"/>
+            </w:pPr>
+            <w:r>
+              <w:rPr>
+                <w:rFonts w:ascii="Courier New" w:hAnsi="Courier New"/>
+                <w:sz w:val="17"/>
+              </w:rPr>
+              <w:t>traceroute</w:t>
+            </w:r>
+          </w:p>
+        </w:tc>
+        <w:tc>
+          <w:tcPr>
+            <w:tcW w:type="dxa" w:w="4082"/>
+            <w:shd w:fill="FFFFFF" w:color="auto" w:val="clear"/>
+          </w:tcPr>
+          <w:p>
+            <w:pPr>
+              <w:spacing w:after="40"/>
+            </w:pPr>
+            <w:r>
+              <w:rPr>
+                <w:sz w:val="17"/>
+              </w:rPr>
+              <w:t>Affiche le chemin réseau vers une destination.</w:t>
+            </w:r>
+          </w:p>
+        </w:tc>
+        <w:tc>
+          <w:tcPr>
+            <w:tcW w:type="dxa" w:w="3855"/>
+            <w:shd w:fill="FFFFFF" w:color="auto" w:val="clear"/>
+          </w:tcPr>
+          <w:p>
+            <w:pPr>
+              <w:spacing w:after="40"/>
+            </w:pPr>
+            <w:r>
+              <w:rPr>
+                <w:rFonts w:ascii="Courier New" w:hAnsi="Courier New"/>
+                <w:sz w:val="17"/>
+              </w:rPr>
+              <w:t>traceroute 8.8.8.8</w:t>
+            </w:r>
+          </w:p>
+        </w:tc>
+      </w:tr>
+      <w:tr>
+        <w:tc>
+          <w:tcPr>
+            <w:tcW w:type="dxa" w:w="1587"/>
+            <w:shd w:fill="F0F4F8" w:color="auto" w:val="clear"/>
+          </w:tcPr>
+          <w:p>
+            <w:pPr>
+              <w:spacing w:after="40"/>
+            </w:pPr>
+            <w:r>
+              <w:rPr>
+                <w:rFonts w:ascii="Courier New" w:hAnsi="Courier New"/>
+                <w:sz w:val="17"/>
+              </w:rPr>
+              <w:t>ifconfig</w:t>
+            </w:r>
+          </w:p>
+        </w:tc>
+        <w:tc>
+          <w:tcPr>
+            <w:tcW w:type="dxa" w:w="4082"/>
+            <w:shd w:fill="F0F4F8" w:color="auto" w:val="clear"/>
+          </w:tcPr>
+          <w:p>
+            <w:pPr>
+              <w:spacing w:after="40"/>
+            </w:pPr>
+            <w:r>
+              <w:rPr>
+                <w:sz w:val="17"/>
+              </w:rPr>
+              <w:t>Affiche la configuration IP de l'appareil.</w:t>
+            </w:r>
+          </w:p>
+        </w:tc>
+        <w:tc>
+          <w:tcPr>
+            <w:tcW w:type="dxa" w:w="3855"/>
+            <w:shd w:fill="F0F4F8" w:color="auto" w:val="clear"/>
+          </w:tcPr>
+          <w:p>
+            <w:pPr>
+              <w:spacing w:after="40"/>
+            </w:pPr>
+            <w:r>
+              <w:rPr>
+                <w:rFonts w:ascii="Courier New" w:hAnsi="Courier New"/>
+                <w:sz w:val="17"/>
+              </w:rPr>
+              <w:t>ifconfig</w:t>
+            </w:r>
+          </w:p>
+        </w:tc>
+      </w:tr>
+      <w:tr>
+        <w:tc>
+          <w:tcPr>
+            <w:tcW w:type="dxa" w:w="1587"/>
+            <w:shd w:fill="FFFFFF" w:color="auto" w:val="clear"/>
+          </w:tcPr>
+          <w:p>
+            <w:pPr>
+              <w:spacing w:after="40"/>
+            </w:pPr>
+            <w:r>
+              <w:rPr>
+                <w:rFonts w:ascii="Courier New" w:hAnsi="Courier New"/>
+                <w:sz w:val="17"/>
+              </w:rPr>
+              <w:t>route</w:t>
+            </w:r>
+          </w:p>
+        </w:tc>
+        <w:tc>
+          <w:tcPr>
+            <w:tcW w:type="dxa" w:w="4082"/>
+            <w:shd w:fill="FFFFFF" w:color="auto" w:val="clear"/>
+          </w:tcPr>
+          <w:p>
+            <w:pPr>
+              <w:spacing w:after="40"/>
+            </w:pPr>
+            <w:r>
+              <w:rPr>
+                <w:sz w:val="17"/>
+              </w:rPr>
+              <w:t>Affiche la table de routage.</w:t>
+            </w:r>
+          </w:p>
+        </w:tc>
+        <w:tc>
+          <w:tcPr>
+            <w:tcW w:type="dxa" w:w="3855"/>
+            <w:shd w:fill="FFFFFF" w:color="auto" w:val="clear"/>
+          </w:tcPr>
+          <w:p>
+            <w:pPr>
+              <w:spacing w:after="40"/>
+            </w:pPr>
+            <w:r>
+              <w:rPr>
+                <w:rFonts w:ascii="Courier New" w:hAnsi="Courier New"/>
+                <w:sz w:val="17"/>
+              </w:rPr>
+              <w:t>route</w:t>
+            </w:r>
+          </w:p>
+        </w:tc>
+      </w:tr>
+      <w:tr>
+        <w:tc>
+          <w:tcPr>
+            <w:tcW w:type="dxa" w:w="1587"/>
+            <w:shd w:fill="F0F4F8" w:color="auto" w:val="clear"/>
+          </w:tcPr>
+          <w:p>
+            <w:pPr>
+              <w:spacing w:after="40"/>
+            </w:pPr>
+            <w:r>
+              <w:rPr>
+                <w:rFonts w:ascii="Courier New" w:hAnsi="Courier New"/>
+                <w:sz w:val="17"/>
+              </w:rPr>
+              <w:t>arp</w:t>
+            </w:r>
+          </w:p>
+        </w:tc>
+        <w:tc>
+          <w:tcPr>
+            <w:tcW w:type="dxa" w:w="4082"/>
+            <w:shd w:fill="F0F4F8" w:color="auto" w:val="clear"/>
+          </w:tcPr>
+          <w:p>
+            <w:pPr>
+              <w:spacing w:after="40"/>
+            </w:pPr>
+            <w:r>
+              <w:rPr>
+                <w:sz w:val="17"/>
+              </w:rPr>
+              <w:t>Affiche la table ARP (IP ↔ MAC).</w:t>
+            </w:r>
+          </w:p>
+        </w:tc>
+        <w:tc>
+          <w:tcPr>
+            <w:tcW w:type="dxa" w:w="3855"/>
+            <w:shd w:fill="F0F4F8" w:color="auto" w:val="clear"/>
+          </w:tcPr>
+          <w:p>
+            <w:pPr>
+              <w:spacing w:after="40"/>
+            </w:pPr>
+            <w:r>
+              <w:rPr>
+                <w:rFonts w:ascii="Courier New" w:hAnsi="Courier New"/>
+                <w:sz w:val="17"/>
+              </w:rPr>
+              <w:t>arp</w:t>
+            </w:r>
+          </w:p>
+        </w:tc>
+      </w:tr>
+      <w:tr>
+        <w:tc>
+          <w:tcPr>
+            <w:tcW w:type="dxa" w:w="1587"/>
+            <w:shd w:fill="FFFFFF" w:color="auto" w:val="clear"/>
+          </w:tcPr>
+          <w:p>
+            <w:pPr>
+              <w:spacing w:after="40"/>
+            </w:pPr>
+            <w:r>
+              <w:rPr>
+                <w:rFonts w:ascii="Courier New" w:hAnsi="Courier New"/>
+                <w:sz w:val="17"/>
+              </w:rPr>
+              <w:t>clear</w:t>
+            </w:r>
+          </w:p>
+        </w:tc>
+        <w:tc>
+          <w:tcPr>
+            <w:tcW w:type="dxa" w:w="4082"/>
+            <w:shd w:fill="FFFFFF" w:color="auto" w:val="clear"/>
+          </w:tcPr>
+          <w:p>
+            <w:pPr>
+              <w:spacing w:after="40"/>
+            </w:pPr>
+            <w:r>
+              <w:rPr>
+                <w:sz w:val="17"/>
+              </w:rPr>
+              <w:t>Efface l'écran du terminal.</w:t>
+            </w:r>
+          </w:p>
+        </w:tc>
+        <w:tc>
+          <w:tcPr>
+            <w:tcW w:type="dxa" w:w="3855"/>
+            <w:shd w:fill="FFFFFF" w:color="auto" w:val="clear"/>
+          </w:tcPr>
+          <w:p>
+            <w:pPr>
+              <w:spacing w:after="40"/>
+            </w:pPr>
+            <w:r>
+              <w:rPr>
+                <w:rFonts w:ascii="Courier New" w:hAnsi="Courier New"/>
+                <w:sz w:val="17"/>
+              </w:rPr>
+              <w:t>clear</w:t>
+            </w:r>
+          </w:p>
+        </w:tc>
+      </w:tr>
+      <w:tr>
+        <w:tc>
+          <w:tcPr>
+            <w:tcW w:type="dxa" w:w="1587"/>
+            <w:shd w:fill="F0F4F8" w:color="auto" w:val="clear"/>
+          </w:tcPr>
+          <w:p>
+            <w:pPr>
+              <w:spacing w:after="40"/>
+            </w:pPr>
+            <w:r>
+              <w:rPr>
+                <w:rFonts w:ascii="Courier New" w:hAnsi="Courier New"/>
+                <w:sz w:val="17"/>
+              </w:rPr>
+              <w:t>help</w:t>
+            </w:r>
+          </w:p>
+        </w:tc>
+        <w:tc>
+          <w:tcPr>
+            <w:tcW w:type="dxa" w:w="4082"/>
+            <w:shd w:fill="F0F4F8" w:color="auto" w:val="clear"/>
+          </w:tcPr>
+          <w:p>
+            <w:pPr>
+              <w:spacing w:after="40"/>
+            </w:pPr>
+            <w:r>
+              <w:rPr>
+                <w:sz w:val="17"/>
+              </w:rPr>
+              <w:t>Affiche toutes les commandes disponibles.</w:t>
+            </w:r>
+          </w:p>
+        </w:tc>
+        <w:tc>
+          <w:tcPr>
+            <w:tcW w:type="dxa" w:w="3855"/>
+            <w:shd w:fill="F0F4F8" w:color="auto" w:val="clear"/>
+          </w:tcPr>
+          <w:p>
+            <w:pPr>
+              <w:spacing w:after="40"/>
+            </w:pPr>
+            <w:r>
+              <w:rPr>
+                <w:rFonts w:ascii="Courier New" w:hAnsi="Courier New"/>
+                <w:sz w:val="17"/>
+              </w:rPr>
+              <w:t>help</w:t>
+            </w:r>
+          </w:p>
+        </w:tc>
+      </w:tr>
+    </w:tbl>
+    <w:p/>
+    <w:p>
+      <w:pPr>
+        <w:pStyle w:val="Heading1"/>
+        <w:keepNext/>
+        <w:spacing w:before="360" w:after="160"/>
+      </w:pPr>
+      <w:r>
+        <w:rPr>
+          <w:b/>
+          <w:color w:val="1A2F1A"/>
+          <w:sz w:val="28"/>
+        </w:rPr>
+        <w:t>3. Configurer les adresses IP</w:t>
+      </w:r>
+    </w:p>
+    <w:p>
+      <w:pPr>
+        <w:spacing w:after="120"/>
+      </w:pPr>
+      <w:r>
+        <w:rPr>
+          <w:b w:val="0"/>
+          <w:sz w:val="19"/>
+        </w:rPr>
+        <w:t xml:space="preserve">Pour configurer manuellement une adresse IP, repassez en </w:t>
+      </w:r>
+      <w:r>
+        <w:rPr>
+          <w:b/>
+          <w:sz w:val="19"/>
+        </w:rPr>
+        <w:t>mode Configuration</w:t>
+      </w:r>
+      <w:r>
+        <w:rPr>
+          <w:b w:val="0"/>
+          <w:sz w:val="19"/>
+        </w:rPr>
+        <w:t>, cliquez sur l'appareil concerné, puis renseignez les champs dans le panneau de droite :</w:t>
+      </w:r>
+    </w:p>
+    <w:tbl>
+      <w:tblPr>
+        <w:tblStyle w:val="TableGrid"/>
+        <w:tblW w:type="auto" w:w="0"/>
+        <w:jc w:val="left"/>
+        <w:tblLook w:firstColumn="1" w:firstRow="1" w:lastColumn="0" w:lastRow="0" w:noHBand="0" w:noVBand="1" w:val="04A0"/>
+      </w:tblPr>
+      <w:tblGrid>
+        <w:gridCol w:w="3135"/>
+        <w:gridCol w:w="3135"/>
+        <w:gridCol w:w="3135"/>
+      </w:tblGrid>
+      <w:tr>
+        <w:tc>
+          <w:tcPr>
+            <w:tcW w:type="dxa" w:w="2268"/>
+            <w:shd w:fill="1A365D" w:color="auto" w:val="clear"/>
+          </w:tcPr>
+          <w:p>
+            <w:pPr>
+              <w:spacing w:after="60"/>
+            </w:pPr>
+            <w:r>
+              <w:rPr>
+                <w:b/>
+                <w:color w:val="FFFFFF"/>
+                <w:sz w:val="17"/>
+              </w:rPr>
+              <w:t>Champ</w:t>
+            </w:r>
+          </w:p>
+        </w:tc>
+        <w:tc>
+          <w:tcPr>
+            <w:tcW w:type="dxa" w:w="2154"/>
+            <w:shd w:fill="1A365D" w:color="auto" w:val="clear"/>
+          </w:tcPr>
+          <w:p>
+            <w:pPr>
+              <w:spacing w:after="60"/>
+            </w:pPr>
+            <w:r>
+              <w:rPr>
+                <w:b/>
+                <w:color w:val="FFFFFF"/>
+                <w:sz w:val="17"/>
+              </w:rPr>
+              <w:t>Exemple</w:t>
+            </w:r>
+          </w:p>
+        </w:tc>
+        <w:tc>
+          <w:tcPr>
+            <w:tcW w:type="dxa" w:w="5102"/>
+            <w:shd w:fill="1A365D" w:color="auto" w:val="clear"/>
+          </w:tcPr>
+          <w:p>
+            <w:pPr>
+              <w:spacing w:after="60"/>
+            </w:pPr>
+            <w:r>
+              <w:rPr>
+                <w:b/>
+                <w:color w:val="FFFFFF"/>
+                <w:sz w:val="17"/>
               </w:rPr>
               <w:t>Description</w:t>
             </w:r>
@@ -192,26 +1019,53 @@
       <w:tr>
         <w:tc>
           <w:tcPr>
-            <w:tcW w:type="dxa" w:w="4320"/>
-            <w:shd w:val="clear" w:color="auto" w:fill="f7fafc"/>
+            <w:tcW w:type="dxa" w:w="2268"/>
+            <w:shd w:fill="FFFFFF" w:color="auto" w:val="clear"/>
           </w:tcPr>
           <w:p>
+            <w:pPr>
+              <w:spacing w:after="40"/>
+            </w:pPr>
             <w:r>
               <w:rPr>
-                <w:rFonts w:ascii="Courier New" w:hAnsi="Courier New"/>
+                <w:sz w:val="17"/>
               </w:rPr>
-              <w:t>ping &lt;IP&gt;</w:t>
+              <w:t>Adresse IP</w:t>
             </w:r>
           </w:p>
         </w:tc>
         <w:tc>
           <w:tcPr>
-            <w:tcW w:type="dxa" w:w="4320"/>
-            <w:shd w:val="clear" w:color="auto" w:fill="f7fafc"/>
+            <w:tcW w:type="dxa" w:w="2154"/>
+            <w:shd w:fill="FFFFFF" w:color="auto" w:val="clear"/>
           </w:tcPr>
           <w:p>
+            <w:pPr>
+              <w:spacing w:after="40"/>
+            </w:pPr>
             <w:r>
-              <w:t>Envoie un ping vers une adresse IP. Ex : ping 192.168.1.1</w:t>
+              <w:rPr>
+                <w:rFonts w:ascii="Courier New" w:hAnsi="Courier New"/>
+                <w:sz w:val="17"/>
+              </w:rPr>
+              <w:t>192.168.1.10</w:t>
+            </w:r>
+          </w:p>
+        </w:tc>
+        <w:tc>
+          <w:tcPr>
+            <w:tcW w:type="dxa" w:w="5102"/>
+            <w:shd w:fill="FFFFFF" w:color="auto" w:val="clear"/>
+          </w:tcPr>
+          <w:p>
+            <w:pPr>
+              <w:spacing w:after="40"/>
+            </w:pPr>
+            <w:r>
+              <w:rPr>
+                <w:sz w:val="17"/>
+              </w:rPr>
+              <w:t>L'identifiant unique de l'appareil sur le réseau.</w:t>
             </w:r>
           </w:p>
         </w:tc>
@@ -219,24 +1073,53 @@
       <w:tr>
         <w:tc>
           <w:tcPr>
-            <w:tcW w:type="dxa" w:w="4320"/>
+            <w:tcW w:type="dxa" w:w="2268"/>
+            <w:shd w:fill="F0F4F8" w:color="auto" w:val="clear"/>
           </w:tcPr>
           <w:p>
+            <w:pPr>
+              <w:spacing w:after="40"/>
+            </w:pPr>
             <w:r>
               <w:rPr>
-                <w:rFonts w:ascii="Courier New" w:hAnsi="Courier New"/>
+                <w:sz w:val="17"/>
               </w:rPr>
-              <w:t>ping &lt;hostname&gt;</w:t>
+              <w:t>Masque de sous-réseau</w:t>
             </w:r>
           </w:p>
         </w:tc>
         <w:tc>
           <w:tcPr>
-            <w:tcW w:type="dxa" w:w="4320"/>
+            <w:tcW w:type="dxa" w:w="2154"/>
+            <w:shd w:fill="F0F4F8" w:color="auto" w:val="clear"/>
           </w:tcPr>
           <w:p>
+            <w:pPr>
+              <w:spacing w:after="40"/>
+            </w:pPr>
             <w:r>
-              <w:t>Ping par nom de domaine. Ex : ping serveur.local</w:t>
+              <w:rPr>
+                <w:rFonts w:ascii="Courier New" w:hAnsi="Courier New"/>
+                <w:sz w:val="17"/>
+              </w:rPr>
+              <w:t>255.255.255.0</w:t>
+            </w:r>
+          </w:p>
+        </w:tc>
+        <w:tc>
+          <w:tcPr>
+            <w:tcW w:type="dxa" w:w="5102"/>
+            <w:shd w:fill="F0F4F8" w:color="auto" w:val="clear"/>
+          </w:tcPr>
+          <w:p>
+            <w:pPr>
+              <w:spacing w:after="40"/>
+            </w:pPr>
+            <w:r>
+              <w:rPr>
+                <w:sz w:val="17"/>
+              </w:rPr>
+              <w:t>Délimite la partie réseau et la partie hôte.</w:t>
             </w:r>
           </w:p>
         </w:tc>
@@ -244,26 +1127,53 @@
       <w:tr>
         <w:tc>
           <w:tcPr>
-            <w:tcW w:type="dxa" w:w="4320"/>
-            <w:shd w:val="clear" w:color="auto" w:fill="f7fafc"/>
+            <w:tcW w:type="dxa" w:w="2268"/>
+            <w:shd w:fill="FFFFFF" w:color="auto" w:val="clear"/>
           </w:tcPr>
           <w:p>
+            <w:pPr>
+              <w:spacing w:after="40"/>
+            </w:pPr>
             <w:r>
               <w:rPr>
-                <w:rFonts w:ascii="Courier New" w:hAnsi="Courier New"/>
+                <w:sz w:val="17"/>
               </w:rPr>
-              <w:t>dns &lt;domaine&gt;</w:t>
+              <w:t>Passerelle (Gateway)</w:t>
             </w:r>
           </w:p>
         </w:tc>
         <w:tc>
           <w:tcPr>
-            <w:tcW w:type="dxa" w:w="4320"/>
-            <w:shd w:val="clear" w:color="auto" w:fill="f7fafc"/>
+            <w:tcW w:type="dxa" w:w="2154"/>
+            <w:shd w:fill="FFFFFF" w:color="auto" w:val="clear"/>
           </w:tcPr>
           <w:p>
+            <w:pPr>
+              <w:spacing w:after="40"/>
+            </w:pPr>
             <w:r>
-              <w:t>Résout un nom en adresse IP.</w:t>
+              <w:rPr>
+                <w:rFonts w:ascii="Courier New" w:hAnsi="Courier New"/>
+                <w:sz w:val="17"/>
+              </w:rPr>
+              <w:t>192.168.1.254</w:t>
+            </w:r>
+          </w:p>
+        </w:tc>
+        <w:tc>
+          <w:tcPr>
+            <w:tcW w:type="dxa" w:w="5102"/>
+            <w:shd w:fill="FFFFFF" w:color="auto" w:val="clear"/>
+          </w:tcPr>
+          <w:p>
+            <w:pPr>
+              <w:spacing w:after="40"/>
+            </w:pPr>
+            <w:r>
+              <w:rPr>
+                <w:sz w:val="17"/>
+              </w:rPr>
+              <w:t>L'adresse du routeur pour sortir du réseau local.</w:t>
             </w:r>
           </w:p>
         </w:tc>
@@ -271,24 +1181,330 @@
       <w:tr>
         <w:tc>
           <w:tcPr>
-            <w:tcW w:type="dxa" w:w="4320"/>
+            <w:tcW w:type="dxa" w:w="2268"/>
+            <w:shd w:fill="F0F4F8" w:color="auto" w:val="clear"/>
           </w:tcPr>
           <w:p>
+            <w:pPr>
+              <w:spacing w:after="40"/>
+            </w:pPr>
             <w:r>
               <w:rPr>
-                <w:rFonts w:ascii="Courier New" w:hAnsi="Courier New"/>
+                <w:sz w:val="17"/>
               </w:rPr>
-              <w:t>http &lt;url&gt;</w:t>
+              <w:t>DNS</w:t>
             </w:r>
           </w:p>
         </w:tc>
         <w:tc>
           <w:tcPr>
-            <w:tcW w:type="dxa" w:w="4320"/>
+            <w:tcW w:type="dxa" w:w="2154"/>
+            <w:shd w:fill="F0F4F8" w:color="auto" w:val="clear"/>
+          </w:tcPr>
+          <w:p>
+            <w:pPr>
+              <w:spacing w:after="40"/>
+            </w:pPr>
+            <w:r>
+              <w:rPr>
+                <w:rFonts w:ascii="Courier New" w:hAnsi="Courier New"/>
+                <w:sz w:val="17"/>
+              </w:rPr>
+              <w:t>192.168.1.1</w:t>
+            </w:r>
+          </w:p>
+        </w:tc>
+        <w:tc>
+          <w:tcPr>
+            <w:tcW w:type="dxa" w:w="5102"/>
+            <w:shd w:fill="F0F4F8" w:color="auto" w:val="clear"/>
+          </w:tcPr>
+          <w:p>
+            <w:pPr>
+              <w:spacing w:after="40"/>
+            </w:pPr>
+            <w:r>
+              <w:rPr>
+                <w:sz w:val="17"/>
+              </w:rPr>
+              <w:t>L'adresse du serveur qui traduit les noms en IP.</w:t>
+            </w:r>
+          </w:p>
+        </w:tc>
+      </w:tr>
+    </w:tbl>
+    <w:p/>
+    <w:tbl>
+      <w:tblPr>
+        <w:tblW w:type="auto" w:w="0"/>
+        <w:jc w:val="left"/>
+        <w:tblLook w:firstColumn="1" w:firstRow="1" w:lastColumn="0" w:lastRow="0" w:noHBand="0" w:noVBand="1" w:val="04A0"/>
+      </w:tblPr>
+      <w:tblGrid>
+        <w:gridCol w:w="9406"/>
+      </w:tblGrid>
+      <w:tr>
+        <w:tc>
+          <w:tcPr>
+            <w:tcW w:type="dxa" w:w="9406"/>
+            <w:shd w:fill="EBF4FF" w:color="auto" w:val="clear"/>
+            <w:tcMar>
+              <w:top w:w="100" w:type="dxa"/>
+              <w:bottom w:w="100" w:type="dxa"/>
+              <w:left w:w="100" w:type="dxa"/>
+              <w:right w:w="100" w:type="dxa"/>
+            </w:tcMar>
           </w:tcPr>
           <w:p>
             <w:r>
-              <w:t>Accède à une page web. Ex : http 192.168.1.1</w:t>
+              <w:rPr>
+                <w:b w:val="0"/>
+                <w:sz w:val="18"/>
+              </w:rPr>
+              <w:t>ℹ  Vous pouvez aussi utiliser la commande dhcp dans le terminal pour obtenir une configuration IP automatiquement (si un serveur DHCP est présent sur le réseau).</w:t>
+            </w:r>
+          </w:p>
+        </w:tc>
+      </w:tr>
+    </w:tbl>
+    <w:p/>
+    <w:p>
+      <w:pPr>
+        <w:pStyle w:val="Heading1"/>
+        <w:keepNext/>
+        <w:spacing w:before="360" w:after="160"/>
+      </w:pPr>
+      <w:r>
+        <w:rPr>
+          <w:b/>
+          <w:color w:val="1A2F1A"/>
+          <w:sz w:val="28"/>
+        </w:rPr>
+        <w:t>4. Les objectifs et le score</w:t>
+      </w:r>
+    </w:p>
+    <w:p>
+      <w:pPr>
+        <w:spacing w:after="120"/>
+      </w:pPr>
+      <w:r>
+        <w:rPr>
+          <w:b w:val="0"/>
+          <w:sz w:val="19"/>
+        </w:rPr>
+        <w:t xml:space="preserve">L'onglet </w:t>
+      </w:r>
+      <w:r>
+        <w:rPr>
+          <w:b/>
+          <w:sz w:val="19"/>
+        </w:rPr>
+        <w:t>📋 Activité</w:t>
+      </w:r>
+      <w:r>
+        <w:rPr>
+          <w:b w:val="0"/>
+          <w:sz w:val="19"/>
+        </w:rPr>
+        <w:t xml:space="preserve"> en bas de l'écran liste les tâches à accomplir. Il est </w:t>
+      </w:r>
+      <w:r>
+        <w:rPr>
+          <w:b/>
+          <w:sz w:val="19"/>
+        </w:rPr>
+        <w:t>toujours visible</w:t>
+      </w:r>
+      <w:r>
+        <w:rPr>
+          <w:b w:val="0"/>
+          <w:sz w:val="19"/>
+        </w:rPr>
+        <w:t xml:space="preserve">, quel que soit le mode. Chaque objectif validé ajoute des points à votre score. Certains objectifs se valident </w:t>
+      </w:r>
+      <w:r>
+        <w:rPr>
+          <w:b/>
+          <w:sz w:val="19"/>
+        </w:rPr>
+        <w:t>automatiquement</w:t>
+      </w:r>
+      <w:r>
+        <w:rPr>
+          <w:b w:val="0"/>
+          <w:sz w:val="19"/>
+        </w:rPr>
+        <w:t xml:space="preserve"> (lorsque la commande réussit), d'autres dès que la configuration est correcte.</w:t>
+      </w:r>
+    </w:p>
+    <w:p>
+      <w:pPr>
+        <w:pStyle w:val="ListBullet"/>
+        <w:spacing w:after="80"/>
+      </w:pPr>
+      <w:r>
+        <w:rPr>
+          <w:b w:val="0"/>
+          <w:sz w:val="19"/>
+        </w:rPr>
+        <w:t xml:space="preserve">✅ </w:t>
+      </w:r>
+      <w:r>
+        <w:rPr>
+          <w:b/>
+          <w:sz w:val="19"/>
+        </w:rPr>
+        <w:t>Objectif validé</w:t>
+      </w:r>
+      <w:r>
+        <w:rPr>
+          <w:b w:val="0"/>
+          <w:sz w:val="19"/>
+        </w:rPr>
+        <w:t xml:space="preserve"> — la condition est remplie, les points sont attribués.</w:t>
+      </w:r>
+    </w:p>
+    <w:p>
+      <w:pPr>
+        <w:pStyle w:val="ListBullet"/>
+        <w:spacing w:after="80"/>
+      </w:pPr>
+      <w:r>
+        <w:rPr>
+          <w:b w:val="0"/>
+          <w:sz w:val="19"/>
+        </w:rPr>
+        <w:t xml:space="preserve">⭕ </w:t>
+      </w:r>
+      <w:r>
+        <w:rPr>
+          <w:b/>
+          <w:sz w:val="19"/>
+        </w:rPr>
+        <w:t>Objectif non validé</w:t>
+      </w:r>
+      <w:r>
+        <w:rPr>
+          <w:b w:val="0"/>
+          <w:sz w:val="19"/>
+        </w:rPr>
+        <w:t xml:space="preserve"> — vérifiez vos branchements et votre configuration IP.</w:t>
+      </w:r>
+    </w:p>
+    <w:tbl>
+      <w:tblPr>
+        <w:tblW w:type="auto" w:w="0"/>
+        <w:jc w:val="left"/>
+        <w:tblLook w:firstColumn="1" w:firstRow="1" w:lastColumn="0" w:lastRow="0" w:noHBand="0" w:noVBand="1" w:val="04A0"/>
+      </w:tblPr>
+      <w:tblGrid>
+        <w:gridCol w:w="9406"/>
+      </w:tblGrid>
+      <w:tr>
+        <w:tc>
+          <w:tcPr>
+            <w:tcW w:type="dxa" w:w="9406"/>
+            <w:shd w:fill="EBF4FF" w:color="auto" w:val="clear"/>
+            <w:tcMar>
+              <w:top w:w="100" w:type="dxa"/>
+              <w:bottom w:w="100" w:type="dxa"/>
+              <w:left w:w="100" w:type="dxa"/>
+              <w:right w:w="100" w:type="dxa"/>
+            </w:tcMar>
+          </w:tcPr>
+          <w:p>
+            <w:r>
+              <w:rPr>
+                <w:b w:val="0"/>
+                <w:sz w:val="18"/>
+              </w:rPr>
+              <w:t>ℹ  La barre de progression indique le pourcentage accompli. Le score est automatiquement transmis à Moodle à la fermeture de l'activité.</w:t>
+            </w:r>
+          </w:p>
+        </w:tc>
+      </w:tr>
+    </w:tbl>
+    <w:p/>
+    <w:p>
+      <w:pPr>
+        <w:pStyle w:val="Heading1"/>
+        <w:keepNext/>
+        <w:spacing w:before="360" w:after="160"/>
+      </w:pPr>
+      <w:r>
+        <w:rPr>
+          <w:b/>
+          <w:color w:val="1A2F1A"/>
+          <w:sz w:val="28"/>
+        </w:rPr>
+        <w:t>5. Exemple guidé : configurer un réseau simple</w:t>
+      </w:r>
+    </w:p>
+    <w:tbl>
+      <w:tblPr>
+        <w:tblStyle w:val="TableGrid"/>
+        <w:tblW w:type="auto" w:w="0"/>
+        <w:jc w:val="left"/>
+        <w:tblLook w:firstColumn="1" w:firstRow="1" w:lastColumn="0" w:lastRow="0" w:noHBand="0" w:noVBand="1" w:val="04A0"/>
+      </w:tblPr>
+      <w:tblGrid>
+        <w:gridCol w:w="3135"/>
+        <w:gridCol w:w="3135"/>
+        <w:gridCol w:w="3135"/>
+      </w:tblGrid>
+      <w:tr>
+        <w:tc>
+          <w:tcPr>
+            <w:tcW w:type="dxa" w:w="1020"/>
+            <w:shd w:fill="1A365D" w:color="auto" w:val="clear"/>
+          </w:tcPr>
+          <w:p>
+            <w:pPr>
+              <w:spacing w:after="80"/>
+              <w:jc w:val="center"/>
+            </w:pPr>
+            <w:r>
+              <w:rPr>
+                <w:b/>
+                <w:color w:val="FFFFFF"/>
+                <w:sz w:val="18"/>
+              </w:rPr>
+              <w:t>Étape 1</w:t>
+            </w:r>
+          </w:p>
+        </w:tc>
+        <w:tc>
+          <w:tcPr>
+            <w:tcW w:type="dxa" w:w="2948"/>
+            <w:shd w:fill="FFFFFF" w:color="auto" w:val="clear"/>
+          </w:tcPr>
+          <w:p>
+            <w:pPr>
+              <w:spacing w:after="80"/>
+            </w:pPr>
+            <w:r>
+              <w:rPr>
+                <w:b/>
+                <w:sz w:val="18"/>
+              </w:rPr>
+              <w:t>Passer en mode Configuration</w:t>
+            </w:r>
+          </w:p>
+        </w:tc>
+        <w:tc>
+          <w:tcPr>
+            <w:tcW w:type="dxa" w:w="5556"/>
+            <w:shd w:fill="FFFFFF" w:color="auto" w:val="clear"/>
+          </w:tcPr>
+          <w:p>
+            <w:pPr>
+              <w:spacing w:after="80"/>
+            </w:pPr>
+            <w:r>
+              <w:rPr>
+                <w:sz w:val="18"/>
+              </w:rPr>
+              <w:t>Cliquez sur le bouton CONFIG en haut à droite.</w:t>
             </w:r>
           </w:p>
         </w:tc>
@@ -296,26 +1512,56 @@
       <w:tr>
         <w:tc>
           <w:tcPr>
-            <w:tcW w:type="dxa" w:w="4320"/>
-            <w:shd w:val="clear" w:color="auto" w:fill="f7fafc"/>
+            <w:tcW w:type="dxa" w:w="1020"/>
+            <w:shd w:fill="1A365D" w:color="auto" w:val="clear"/>
           </w:tcPr>
           <w:p>
+            <w:pPr>
+              <w:spacing w:after="80"/>
+              <w:jc w:val="center"/>
+            </w:pPr>
             <w:r>
               <w:rPr>
-                <w:rFonts w:ascii="Courier New" w:hAnsi="Courier New"/>
+                <w:b/>
+                <w:color w:val="FFFFFF"/>
+                <w:sz w:val="18"/>
               </w:rPr>
-              <w:t>dhcp</w:t>
+              <w:t>Étape 2</w:t>
             </w:r>
           </w:p>
         </w:tc>
         <w:tc>
           <w:tcPr>
-            <w:tcW w:type="dxa" w:w="4320"/>
-            <w:shd w:val="clear" w:color="auto" w:fill="f7fafc"/>
+            <w:tcW w:type="dxa" w:w="2948"/>
+            <w:shd w:fill="F0F4F8" w:color="auto" w:val="clear"/>
           </w:tcPr>
           <w:p>
+            <w:pPr>
+              <w:spacing w:after="80"/>
+            </w:pPr>
             <w:r>
-              <w:t>Obtient une IP automatiquement via le serveur DHCP.</w:t>
+              <w:rPr>
+                <w:b/>
+                <w:sz w:val="18"/>
+              </w:rPr>
+              <w:t>Vérifier le câblage</w:t>
+            </w:r>
+          </w:p>
+        </w:tc>
+        <w:tc>
+          <w:tcPr>
+            <w:tcW w:type="dxa" w:w="5556"/>
+            <w:shd w:fill="F0F4F8" w:color="auto" w:val="clear"/>
+          </w:tcPr>
+          <w:p>
+            <w:pPr>
+              <w:spacing w:after="80"/>
+            </w:pPr>
+            <w:r>
+              <w:rPr>
+                <w:sz w:val="18"/>
+              </w:rPr>
+              <w:t>Le PC doit être relié au Switch, et le Switch au Serveur.</w:t>
             </w:r>
           </w:p>
         </w:tc>
@@ -323,24 +1569,56 @@
       <w:tr>
         <w:tc>
           <w:tcPr>
-            <w:tcW w:type="dxa" w:w="4320"/>
+            <w:tcW w:type="dxa" w:w="1020"/>
+            <w:shd w:fill="1A365D" w:color="auto" w:val="clear"/>
           </w:tcPr>
           <w:p>
+            <w:pPr>
+              <w:spacing w:after="80"/>
+              <w:jc w:val="center"/>
+            </w:pPr>
             <w:r>
               <w:rPr>
-                <w:rFonts w:ascii="Courier New" w:hAnsi="Courier New"/>
+                <w:b/>
+                <w:color w:val="FFFFFF"/>
+                <w:sz w:val="18"/>
               </w:rPr>
-              <w:t>ifconfig</w:t>
+              <w:t>Étape 3</w:t>
             </w:r>
           </w:p>
         </w:tc>
         <w:tc>
           <w:tcPr>
-            <w:tcW w:type="dxa" w:w="4320"/>
+            <w:tcW w:type="dxa" w:w="2948"/>
+            <w:shd w:fill="FFFFFF" w:color="auto" w:val="clear"/>
           </w:tcPr>
           <w:p>
+            <w:pPr>
+              <w:spacing w:after="80"/>
+            </w:pPr>
             <w:r>
-              <w:t>Affiche la configuration IP de l'appareil.</w:t>
+              <w:rPr>
+                <w:b/>
+                <w:sz w:val="18"/>
+              </w:rPr>
+              <w:t>Configurer le Serveur</w:t>
+            </w:r>
+          </w:p>
+        </w:tc>
+        <w:tc>
+          <w:tcPr>
+            <w:tcW w:type="dxa" w:w="5556"/>
+            <w:shd w:fill="FFFFFF" w:color="auto" w:val="clear"/>
+          </w:tcPr>
+          <w:p>
+            <w:pPr>
+              <w:spacing w:after="80"/>
+            </w:pPr>
+            <w:r>
+              <w:rPr>
+                <w:sz w:val="18"/>
+              </w:rPr>
+              <w:t>Cliquez sur Serveur → IP : 192.168.1.1 / Masque : 255.255.255.0</w:t>
             </w:r>
           </w:p>
         </w:tc>
@@ -348,26 +1626,56 @@
       <w:tr>
         <w:tc>
           <w:tcPr>
-            <w:tcW w:type="dxa" w:w="4320"/>
-            <w:shd w:val="clear" w:color="auto" w:fill="f7fafc"/>
+            <w:tcW w:type="dxa" w:w="1020"/>
+            <w:shd w:fill="1A365D" w:color="auto" w:val="clear"/>
           </w:tcPr>
           <w:p>
+            <w:pPr>
+              <w:spacing w:after="80"/>
+              <w:jc w:val="center"/>
+            </w:pPr>
             <w:r>
               <w:rPr>
-                <w:rFonts w:ascii="Courier New" w:hAnsi="Courier New"/>
+                <w:b/>
+                <w:color w:val="FFFFFF"/>
+                <w:sz w:val="18"/>
               </w:rPr>
-              <w:t>route</w:t>
+              <w:t>Étape 4</w:t>
             </w:r>
           </w:p>
         </w:tc>
         <w:tc>
           <w:tcPr>
-            <w:tcW w:type="dxa" w:w="4320"/>
-            <w:shd w:val="clear" w:color="auto" w:fill="f7fafc"/>
+            <w:tcW w:type="dxa" w:w="2948"/>
+            <w:shd w:fill="F0F4F8" w:color="auto" w:val="clear"/>
           </w:tcPr>
           <w:p>
+            <w:pPr>
+              <w:spacing w:after="80"/>
+            </w:pPr>
             <w:r>
-              <w:t>Affiche la table de routage.</w:t>
+              <w:rPr>
+                <w:b/>
+                <w:sz w:val="18"/>
+              </w:rPr>
+              <w:t>Configurer le PC</w:t>
+            </w:r>
+          </w:p>
+        </w:tc>
+        <w:tc>
+          <w:tcPr>
+            <w:tcW w:type="dxa" w:w="5556"/>
+            <w:shd w:fill="F0F4F8" w:color="auto" w:val="clear"/>
+          </w:tcPr>
+          <w:p>
+            <w:pPr>
+              <w:spacing w:after="80"/>
+            </w:pPr>
+            <w:r>
+              <w:rPr>
+                <w:sz w:val="18"/>
+              </w:rPr>
+              <w:t>Cliquez sur PC 1 → IP : 192.168.1.10 / Masque : 255.255.255.0</w:t>
             </w:r>
           </w:p>
         </w:tc>
@@ -375,24 +1683,56 @@
       <w:tr>
         <w:tc>
           <w:tcPr>
-            <w:tcW w:type="dxa" w:w="4320"/>
+            <w:tcW w:type="dxa" w:w="1020"/>
+            <w:shd w:fill="1A365D" w:color="auto" w:val="clear"/>
           </w:tcPr>
           <w:p>
+            <w:pPr>
+              <w:spacing w:after="80"/>
+              <w:jc w:val="center"/>
+            </w:pPr>
             <w:r>
               <w:rPr>
-                <w:rFonts w:ascii="Courier New" w:hAnsi="Courier New"/>
+                <w:b/>
+                <w:color w:val="FFFFFF"/>
+                <w:sz w:val="18"/>
               </w:rPr>
-              <w:t>arp</w:t>
+              <w:t>Étape 5</w:t>
             </w:r>
           </w:p>
         </w:tc>
         <w:tc>
           <w:tcPr>
-            <w:tcW w:type="dxa" w:w="4320"/>
+            <w:tcW w:type="dxa" w:w="2948"/>
+            <w:shd w:fill="FFFFFF" w:color="auto" w:val="clear"/>
           </w:tcPr>
           <w:p>
+            <w:pPr>
+              <w:spacing w:after="80"/>
+            </w:pPr>
             <w:r>
-              <w:t>Affiche les correspondances IP ↔ MAC.</w:t>
+              <w:rPr>
+                <w:b/>
+                <w:sz w:val="18"/>
+              </w:rPr>
+              <w:t>Passer en mode Simulation</w:t>
+            </w:r>
+          </w:p>
+        </w:tc>
+        <w:tc>
+          <w:tcPr>
+            <w:tcW w:type="dxa" w:w="5556"/>
+            <w:shd w:fill="FFFFFF" w:color="auto" w:val="clear"/>
+          </w:tcPr>
+          <w:p>
+            <w:pPr>
+              <w:spacing w:after="80"/>
+            </w:pPr>
+            <w:r>
+              <w:rPr>
+                <w:sz w:val="18"/>
+              </w:rPr>
+              <w:t>Cliquez sur SIMU en haut à droite.</w:t>
             </w:r>
           </w:p>
         </w:tc>
@@ -400,26 +1740,56 @@
       <w:tr>
         <w:tc>
           <w:tcPr>
-            <w:tcW w:type="dxa" w:w="4320"/>
-            <w:shd w:val="clear" w:color="auto" w:fill="f7fafc"/>
+            <w:tcW w:type="dxa" w:w="1020"/>
+            <w:shd w:fill="1A365D" w:color="auto" w:val="clear"/>
           </w:tcPr>
           <w:p>
+            <w:pPr>
+              <w:spacing w:after="80"/>
+              <w:jc w:val="center"/>
+            </w:pPr>
             <w:r>
               <w:rPr>
-                <w:rFonts w:ascii="Courier New" w:hAnsi="Courier New"/>
+                <w:b/>
+                <w:color w:val="FFFFFF"/>
+                <w:sz w:val="18"/>
               </w:rPr>
-              <w:t>clear</w:t>
+              <w:t>Étape 6</w:t>
             </w:r>
           </w:p>
         </w:tc>
         <w:tc>
           <w:tcPr>
-            <w:tcW w:type="dxa" w:w="4320"/>
-            <w:shd w:val="clear" w:color="auto" w:fill="f7fafc"/>
+            <w:tcW w:type="dxa" w:w="2948"/>
+            <w:shd w:fill="F0F4F8" w:color="auto" w:val="clear"/>
           </w:tcPr>
           <w:p>
+            <w:pPr>
+              <w:spacing w:after="80"/>
+            </w:pPr>
             <w:r>
-              <w:t>Efface le terminal.</w:t>
+              <w:rPr>
+                <w:b/>
+                <w:sz w:val="18"/>
+              </w:rPr>
+              <w:t>Tester la connexion</w:t>
+            </w:r>
+          </w:p>
+        </w:tc>
+        <w:tc>
+          <w:tcPr>
+            <w:tcW w:type="dxa" w:w="5556"/>
+            <w:shd w:fill="F0F4F8" w:color="auto" w:val="clear"/>
+          </w:tcPr>
+          <w:p>
+            <w:pPr>
+              <w:spacing w:after="80"/>
+            </w:pPr>
+            <w:r>
+              <w:rPr>
+                <w:sz w:val="18"/>
+              </w:rPr>
+              <w:t>Cliquez sur PC 1, tapez : ping 192.168.1.1</w:t>
             </w:r>
           </w:p>
         </w:tc>
@@ -427,636 +1797,73 @@
       <w:tr>
         <w:tc>
           <w:tcPr>
-            <w:tcW w:type="dxa" w:w="4320"/>
+            <w:tcW w:type="dxa" w:w="1020"/>
+            <w:shd w:fill="1A365D" w:color="auto" w:val="clear"/>
           </w:tcPr>
           <w:p>
+            <w:pPr>
+              <w:spacing w:after="80"/>
+              <w:jc w:val="center"/>
+            </w:pPr>
             <w:r>
               <w:rPr>
-                <w:rFonts w:ascii="Courier New" w:hAnsi="Courier New"/>
+                <w:b/>
+                <w:color w:val="FFFFFF"/>
+                <w:sz w:val="18"/>
               </w:rPr>
-              <w:t>help</w:t>
+              <w:t>Étape 7</w:t>
             </w:r>
           </w:p>
         </w:tc>
         <w:tc>
           <w:tcPr>
-            <w:tcW w:type="dxa" w:w="4320"/>
+            <w:tcW w:type="dxa" w:w="2948"/>
+            <w:shd w:fill="FFFFFF" w:color="auto" w:val="clear"/>
           </w:tcPr>
           <w:p>
+            <w:pPr>
+              <w:spacing w:after="80"/>
+            </w:pPr>
             <w:r>
-              <w:t>Liste toutes les commandes.</w:t>
+              <w:rPr>
+                <w:b/>
+                <w:sz w:val="18"/>
+              </w:rPr>
+              <w:t>Vérifier les objectifs</w:t>
+            </w:r>
+          </w:p>
+        </w:tc>
+        <w:tc>
+          <w:tcPr>
+            <w:tcW w:type="dxa" w:w="5556"/>
+            <w:shd w:fill="FFFFFF" w:color="auto" w:val="clear"/>
+          </w:tcPr>
+          <w:p>
+            <w:pPr>
+              <w:spacing w:after="80"/>
+            </w:pPr>
+            <w:r>
+              <w:rPr>
+                <w:sz w:val="18"/>
+              </w:rPr>
+              <w:t>La pastille ✅ apparaît dans l'onglet 📋 Activité si le ping réussit.</w:t>
             </w:r>
           </w:p>
         </w:tc>
       </w:tr>
     </w:tbl>
+    <w:p/>
     <w:p>
       <w:pPr>
         <w:pStyle w:val="Heading1"/>
-        <w:jc w:val="left"/>
-      </w:pPr>
-      <w:r>
-        <w:rPr>
-          <w:color w:val="1A202C"/>
-        </w:rPr>
-        <w:t>3. Configurer les adresses IP</w:t>
-      </w:r>
-    </w:p>
-    <w:p>
-      <w:r>
-        <w:t>En mode Configuration, cliquez sur l'appareil puis renseignez les champs dans le panneau de droite :</w:t>
-      </w:r>
-    </w:p>
-    <w:tbl>
-      <w:tblPr>
-        <w:tblStyle w:val="TableGrid"/>
-        <w:tblW w:type="auto" w:w="0"/>
-        <w:tblLook w:firstColumn="1" w:firstRow="1" w:lastColumn="0" w:lastRow="0" w:noHBand="0" w:noVBand="1" w:val="04A0"/>
-      </w:tblPr>
-      <w:tblGrid>
-        <w:gridCol w:w="2880"/>
-        <w:gridCol w:w="2880"/>
-        <w:gridCol w:w="2880"/>
-      </w:tblGrid>
-      <w:tr>
-        <w:tc>
-          <w:tcPr>
-            <w:tcW w:type="dxa" w:w="2880"/>
-            <w:shd w:val="clear" w:color="auto" w:fill="1a202c"/>
-          </w:tcPr>
-          <w:p>
-            <w:r>
-              <w:rPr>
-                <w:b/>
-                <w:color w:val="FFFFFF"/>
-              </w:rPr>
-              <w:t>Champ</w:t>
-            </w:r>
-          </w:p>
-        </w:tc>
-        <w:tc>
-          <w:tcPr>
-            <w:tcW w:type="dxa" w:w="2880"/>
-            <w:shd w:val="clear" w:color="auto" w:fill="1a202c"/>
-          </w:tcPr>
-          <w:p>
-            <w:r>
-              <w:rPr>
-                <w:b/>
-                <w:color w:val="FFFFFF"/>
-              </w:rPr>
-              <w:t>Exemple</w:t>
-            </w:r>
-          </w:p>
-        </w:tc>
-        <w:tc>
-          <w:tcPr>
-            <w:tcW w:type="dxa" w:w="2880"/>
-            <w:shd w:val="clear" w:color="auto" w:fill="1a202c"/>
-          </w:tcPr>
-          <w:p>
-            <w:r>
-              <w:rPr>
-                <w:b/>
-                <w:color w:val="FFFFFF"/>
-              </w:rPr>
-              <w:t>Description</w:t>
-            </w:r>
-          </w:p>
-        </w:tc>
-      </w:tr>
-      <w:tr>
-        <w:tc>
-          <w:tcPr>
-            <w:tcW w:type="dxa" w:w="2880"/>
-            <w:shd w:val="clear" w:color="auto" w:fill="ebf8ff"/>
-          </w:tcPr>
-          <w:p>
-            <w:r>
-              <w:t>Adresse IP</w:t>
-            </w:r>
-          </w:p>
-        </w:tc>
-        <w:tc>
-          <w:tcPr>
-            <w:tcW w:type="dxa" w:w="2880"/>
-            <w:shd w:val="clear" w:color="auto" w:fill="ebf8ff"/>
-          </w:tcPr>
-          <w:p>
-            <w:r>
-              <w:t>192.168.1.10</w:t>
-            </w:r>
-          </w:p>
-        </w:tc>
-        <w:tc>
-          <w:tcPr>
-            <w:tcW w:type="dxa" w:w="2880"/>
-            <w:shd w:val="clear" w:color="auto" w:fill="ebf8ff"/>
-          </w:tcPr>
-          <w:p>
-            <w:r>
-              <w:t>Identifiant unique sur le réseau.</w:t>
-            </w:r>
-          </w:p>
-        </w:tc>
-      </w:tr>
-      <w:tr>
-        <w:tc>
-          <w:tcPr>
-            <w:tcW w:type="dxa" w:w="2880"/>
-          </w:tcPr>
-          <w:p>
-            <w:r>
-              <w:t>Masque</w:t>
-            </w:r>
-          </w:p>
-        </w:tc>
-        <w:tc>
-          <w:tcPr>
-            <w:tcW w:type="dxa" w:w="2880"/>
-          </w:tcPr>
-          <w:p>
-            <w:r>
-              <w:t>255.255.255.0</w:t>
-            </w:r>
-          </w:p>
-        </w:tc>
-        <w:tc>
-          <w:tcPr>
-            <w:tcW w:type="dxa" w:w="2880"/>
-          </w:tcPr>
-          <w:p>
-            <w:r>
-              <w:t>Délimite réseau et hôte.</w:t>
-            </w:r>
-          </w:p>
-        </w:tc>
-      </w:tr>
-      <w:tr>
-        <w:tc>
-          <w:tcPr>
-            <w:tcW w:type="dxa" w:w="2880"/>
-            <w:shd w:val="clear" w:color="auto" w:fill="ebf8ff"/>
-          </w:tcPr>
-          <w:p>
-            <w:r>
-              <w:t>Passerelle</w:t>
-            </w:r>
-          </w:p>
-        </w:tc>
-        <w:tc>
-          <w:tcPr>
-            <w:tcW w:type="dxa" w:w="2880"/>
-            <w:shd w:val="clear" w:color="auto" w:fill="ebf8ff"/>
-          </w:tcPr>
-          <w:p>
-            <w:r>
-              <w:t>192.168.1.254</w:t>
-            </w:r>
-          </w:p>
-        </w:tc>
-        <w:tc>
-          <w:tcPr>
-            <w:tcW w:type="dxa" w:w="2880"/>
-            <w:shd w:val="clear" w:color="auto" w:fill="ebf8ff"/>
-          </w:tcPr>
-          <w:p>
-            <w:r>
-              <w:t>Adresse du routeur pour sortir du LAN.</w:t>
-            </w:r>
-          </w:p>
-        </w:tc>
-      </w:tr>
-      <w:tr>
-        <w:tc>
-          <w:tcPr>
-            <w:tcW w:type="dxa" w:w="2880"/>
-          </w:tcPr>
-          <w:p>
-            <w:r>
-              <w:t>DNS</w:t>
-            </w:r>
-          </w:p>
-        </w:tc>
-        <w:tc>
-          <w:tcPr>
-            <w:tcW w:type="dxa" w:w="2880"/>
-          </w:tcPr>
-          <w:p>
-            <w:r>
-              <w:t>192.168.1.1</w:t>
-            </w:r>
-          </w:p>
-        </w:tc>
-        <w:tc>
-          <w:tcPr>
-            <w:tcW w:type="dxa" w:w="2880"/>
-          </w:tcPr>
-          <w:p>
-            <w:r>
-              <w:t>Serveur qui traduit les noms en IP.</w:t>
-            </w:r>
-          </w:p>
-        </w:tc>
-      </w:tr>
-    </w:tbl>
-    <w:p>
-      <w:pPr>
-        <w:pStyle w:val="Heading1"/>
-        <w:jc w:val="left"/>
-      </w:pPr>
-      <w:r>
-        <w:rPr>
-          <w:color w:val="1A202C"/>
-        </w:rPr>
-        <w:t>4. Objectifs et score</w:t>
-      </w:r>
-    </w:p>
-    <w:p>
-      <w:r>
-        <w:t>Le panneau objectifs liste les tâches à accomplir :</w:t>
-      </w:r>
-    </w:p>
-    <w:p>
-      <w:pPr>
-        <w:ind w:left="283"/>
+        <w:keepNext/>
+        <w:spacing w:before="360" w:after="160"/>
       </w:pPr>
       <w:r>
         <w:rPr>
           <w:b/>
-        </w:rPr>
-        <w:t>✅ Objectif validé</w:t>
-      </w:r>
-      <w:r>
-        <w:t xml:space="preserve"> — La condition est remplie, les points sont attribués.</w:t>
-      </w:r>
-    </w:p>
-    <w:p>
-      <w:pPr>
-        <w:ind w:left="283"/>
-      </w:pPr>
-      <w:r>
-        <w:rPr>
-          <w:b/>
-        </w:rPr>
-        <w:t>⬜ Non validé</w:t>
-      </w:r>
-      <w:r>
-        <w:t xml:space="preserve"> — Vérifiez votre câblage et votre configuration IP.</w:t>
-      </w:r>
-    </w:p>
-    <w:p>
-      <w:pPr>
-        <w:ind w:left="283"/>
-      </w:pPr>
-      <w:r>
-        <w:rPr>
-          <w:b/>
-        </w:rPr>
-        <w:t>🔒 Verrouillé</w:t>
-      </w:r>
-      <w:r>
-        <w:t xml:space="preserve"> — Un autre objectif doit d'abord être complété.</w:t>
-      </w:r>
-    </w:p>
-    <w:p>
-      <w:pPr>
-        <w:spacing w:before="80" w:after="120"/>
-        <w:ind w:left="283" w:right="283"/>
-      </w:pPr>
-      <w:r>
-        <w:rPr>
-          <w:color w:val="744210"/>
-          <w:sz w:val="18"/>
-        </w:rPr>
-        <w:t>📊 Le score est automatiquement transmis à Moodle à la fermeture de l'activité.</w:t>
-      </w:r>
-    </w:p>
-    <w:p>
-      <w:r>
-        <w:br w:type="page"/>
-      </w:r>
-    </w:p>
-    <w:p>
-      <w:pPr>
-        <w:pStyle w:val="Heading1"/>
-        <w:jc w:val="left"/>
-      </w:pPr>
-      <w:r>
-        <w:rPr>
-          <w:color w:val="1A202C"/>
-        </w:rPr>
-        <w:t>5. Exemple guidé</w:t>
-      </w:r>
-    </w:p>
-    <w:p>
-      <w:r>
-        <w:t>Séquence pour configurer et tester un réseau local simple :</w:t>
-      </w:r>
-    </w:p>
-    <w:tbl>
-      <w:tblPr>
-        <w:tblStyle w:val="TableGrid"/>
-        <w:tblW w:type="auto" w:w="0"/>
-        <w:tblLook w:firstColumn="1" w:firstRow="1" w:lastColumn="0" w:lastRow="0" w:noHBand="0" w:noVBand="1" w:val="04A0"/>
-      </w:tblPr>
-      <w:tblGrid>
-        <w:gridCol w:w="2880"/>
-        <w:gridCol w:w="2880"/>
-        <w:gridCol w:w="2880"/>
-      </w:tblGrid>
-      <w:tr>
-        <w:tc>
-          <w:tcPr>
-            <w:tcW w:type="dxa" w:w="2880"/>
-            <w:shd w:val="clear" w:color="auto" w:fill="1a202c"/>
-          </w:tcPr>
-          <w:p>
-            <w:r>
-              <w:rPr>
-                <w:b/>
-                <w:color w:val="FFFFFF"/>
-              </w:rPr>
-              <w:t>Étape</w:t>
-            </w:r>
-          </w:p>
-        </w:tc>
-        <w:tc>
-          <w:tcPr>
-            <w:tcW w:type="dxa" w:w="2880"/>
-            <w:shd w:val="clear" w:color="auto" w:fill="1a202c"/>
-          </w:tcPr>
-          <w:p>
-            <w:r>
-              <w:rPr>
-                <w:b/>
-                <w:color w:val="FFFFFF"/>
-              </w:rPr>
-              <w:t>Action</w:t>
-            </w:r>
-          </w:p>
-        </w:tc>
-        <w:tc>
-          <w:tcPr>
-            <w:tcW w:type="dxa" w:w="2880"/>
-            <w:shd w:val="clear" w:color="auto" w:fill="1a202c"/>
-          </w:tcPr>
-          <w:p>
-            <w:r>
-              <w:rPr>
-                <w:b/>
-                <w:color w:val="FFFFFF"/>
-              </w:rPr>
-              <w:t>Détail</w:t>
-            </w:r>
-          </w:p>
-        </w:tc>
-      </w:tr>
-      <w:tr>
-        <w:tc>
-          <w:tcPr>
-            <w:tcW w:type="dxa" w:w="2880"/>
-            <w:shd w:val="clear" w:color="auto" w:fill="f0fff4"/>
-          </w:tcPr>
-          <w:p>
-            <w:r>
-              <w:t>1</w:t>
-            </w:r>
-          </w:p>
-        </w:tc>
-        <w:tc>
-          <w:tcPr>
-            <w:tcW w:type="dxa" w:w="2880"/>
-            <w:shd w:val="clear" w:color="auto" w:fill="f0fff4"/>
-          </w:tcPr>
-          <w:p>
-            <w:r>
-              <w:t>Passez en mode Configuration</w:t>
-            </w:r>
-          </w:p>
-        </w:tc>
-        <w:tc>
-          <w:tcPr>
-            <w:tcW w:type="dxa" w:w="2880"/>
-            <w:shd w:val="clear" w:color="auto" w:fill="f0fff4"/>
-          </w:tcPr>
-          <w:p>
-            <w:r>
-              <w:t>Bouton CONFIG en haut à droite.</w:t>
-            </w:r>
-          </w:p>
-        </w:tc>
-      </w:tr>
-      <w:tr>
-        <w:tc>
-          <w:tcPr>
-            <w:tcW w:type="dxa" w:w="2880"/>
-          </w:tcPr>
-          <w:p>
-            <w:r>
-              <w:t>2</w:t>
-            </w:r>
-          </w:p>
-        </w:tc>
-        <w:tc>
-          <w:tcPr>
-            <w:tcW w:type="dxa" w:w="2880"/>
-          </w:tcPr>
-          <w:p>
-            <w:r>
-              <w:t>Vérifiez le câblage</w:t>
-            </w:r>
-          </w:p>
-        </w:tc>
-        <w:tc>
-          <w:tcPr>
-            <w:tcW w:type="dxa" w:w="2880"/>
-          </w:tcPr>
-          <w:p>
-            <w:r>
-              <w:t>PC relié au Switch, Switch relié au Serveur.</w:t>
-            </w:r>
-          </w:p>
-        </w:tc>
-      </w:tr>
-      <w:tr>
-        <w:tc>
-          <w:tcPr>
-            <w:tcW w:type="dxa" w:w="2880"/>
-            <w:shd w:val="clear" w:color="auto" w:fill="f0fff4"/>
-          </w:tcPr>
-          <w:p>
-            <w:r>
-              <w:t>3</w:t>
-            </w:r>
-          </w:p>
-        </w:tc>
-        <w:tc>
-          <w:tcPr>
-            <w:tcW w:type="dxa" w:w="2880"/>
-            <w:shd w:val="clear" w:color="auto" w:fill="f0fff4"/>
-          </w:tcPr>
-          <w:p>
-            <w:r>
-              <w:t>Configurez le Serveur</w:t>
-            </w:r>
-          </w:p>
-        </w:tc>
-        <w:tc>
-          <w:tcPr>
-            <w:tcW w:type="dxa" w:w="2880"/>
-            <w:shd w:val="clear" w:color="auto" w:fill="f0fff4"/>
-          </w:tcPr>
-          <w:p>
-            <w:r>
-              <w:t>IP : 192.168.1.1 / Masque : 255.255.255.0</w:t>
-            </w:r>
-          </w:p>
-        </w:tc>
-      </w:tr>
-      <w:tr>
-        <w:tc>
-          <w:tcPr>
-            <w:tcW w:type="dxa" w:w="2880"/>
-          </w:tcPr>
-          <w:p>
-            <w:r>
-              <w:t>4</w:t>
-            </w:r>
-          </w:p>
-        </w:tc>
-        <w:tc>
-          <w:tcPr>
-            <w:tcW w:type="dxa" w:w="2880"/>
-          </w:tcPr>
-          <w:p>
-            <w:r>
-              <w:t>Configurez le PC</w:t>
-            </w:r>
-          </w:p>
-        </w:tc>
-        <w:tc>
-          <w:tcPr>
-            <w:tcW w:type="dxa" w:w="2880"/>
-          </w:tcPr>
-          <w:p>
-            <w:r>
-              <w:t>IP : 192.168.1.10 / Masque : 255.255.255.0</w:t>
-            </w:r>
-          </w:p>
-        </w:tc>
-      </w:tr>
-      <w:tr>
-        <w:tc>
-          <w:tcPr>
-            <w:tcW w:type="dxa" w:w="2880"/>
-            <w:shd w:val="clear" w:color="auto" w:fill="f0fff4"/>
-          </w:tcPr>
-          <w:p>
-            <w:r>
-              <w:t>5</w:t>
-            </w:r>
-          </w:p>
-        </w:tc>
-        <w:tc>
-          <w:tcPr>
-            <w:tcW w:type="dxa" w:w="2880"/>
-            <w:shd w:val="clear" w:color="auto" w:fill="f0fff4"/>
-          </w:tcPr>
-          <w:p>
-            <w:r>
-              <w:t>Passez en mode Simulation</w:t>
-            </w:r>
-          </w:p>
-        </w:tc>
-        <w:tc>
-          <w:tcPr>
-            <w:tcW w:type="dxa" w:w="2880"/>
-            <w:shd w:val="clear" w:color="auto" w:fill="f0fff4"/>
-          </w:tcPr>
-          <w:p>
-            <w:r>
-              <w:t>Bouton SIMU en haut à droite.</w:t>
-            </w:r>
-          </w:p>
-        </w:tc>
-      </w:tr>
-      <w:tr>
-        <w:tc>
-          <w:tcPr>
-            <w:tcW w:type="dxa" w:w="2880"/>
-          </w:tcPr>
-          <w:p>
-            <w:r>
-              <w:t>6</w:t>
-            </w:r>
-          </w:p>
-        </w:tc>
-        <w:tc>
-          <w:tcPr>
-            <w:tcW w:type="dxa" w:w="2880"/>
-          </w:tcPr>
-          <w:p>
-            <w:r>
-              <w:t>Testez la connexion</w:t>
-            </w:r>
-          </w:p>
-        </w:tc>
-        <w:tc>
-          <w:tcPr>
-            <w:tcW w:type="dxa" w:w="2880"/>
-          </w:tcPr>
-          <w:p>
-            <w:r>
-              <w:t>Cliquez sur PC 1 → tapez : ping 192.168.1.1</w:t>
-            </w:r>
-          </w:p>
-        </w:tc>
-      </w:tr>
-      <w:tr>
-        <w:tc>
-          <w:tcPr>
-            <w:tcW w:type="dxa" w:w="2880"/>
-            <w:shd w:val="clear" w:color="auto" w:fill="f0fff4"/>
-          </w:tcPr>
-          <w:p>
-            <w:r>
-              <w:t>7</w:t>
-            </w:r>
-          </w:p>
-        </w:tc>
-        <w:tc>
-          <w:tcPr>
-            <w:tcW w:type="dxa" w:w="2880"/>
-            <w:shd w:val="clear" w:color="auto" w:fill="f0fff4"/>
-          </w:tcPr>
-          <w:p>
-            <w:r>
-              <w:t>Vérifiez les objectifs</w:t>
-            </w:r>
-          </w:p>
-        </w:tc>
-        <w:tc>
-          <w:tcPr>
-            <w:tcW w:type="dxa" w:w="2880"/>
-            <w:shd w:val="clear" w:color="auto" w:fill="f0fff4"/>
-          </w:tcPr>
-          <w:p>
-            <w:r>
-              <w:t>✅ apparaît si le ping réussit.</w:t>
-            </w:r>
-          </w:p>
-        </w:tc>
-      </w:tr>
-    </w:tbl>
-    <w:p>
-      <w:pPr>
-        <w:pStyle w:val="Heading1"/>
-        <w:jc w:val="left"/>
-      </w:pPr>
-      <w:r>
-        <w:rPr>
-          <w:color w:val="1A202C"/>
+          <w:color w:val="1A2F1A"/>
+          <w:sz w:val="28"/>
         </w:rPr>
         <w:t>6. En cas de problème</w:t>
       </w:r>
@@ -1065,57 +1872,115 @@
       <w:r>
         <w:rPr>
           <w:b/>
+          <w:color w:val="2F855A"/>
+          <w:sz w:val="21"/>
         </w:rPr>
-        <w:t>❓ Le ping échoue</w:t>
+        <w:t>■ Le ping échoue</w:t>
       </w:r>
     </w:p>
     <w:p>
+      <w:pPr>
+        <w:spacing w:after="120"/>
+      </w:pPr>
       <w:r>
-        <w:t>Vérifiez que les deux appareils sont dans le même sous-réseau ou qu'une passerelle est configurée.</w:t>
+        <w:rPr>
+          <w:b w:val="0"/>
+          <w:sz w:val="19"/>
+        </w:rPr>
+        <w:t>Vérifiez que les deux appareils sont dans le même sous-réseau (même préfixe réseau avec le masque), ou qu'une passerelle est configurée pour sortir du réseau.</w:t>
       </w:r>
     </w:p>
     <w:p>
       <w:r>
         <w:rPr>
           <w:b/>
+          <w:color w:val="2F855A"/>
+          <w:sz w:val="21"/>
         </w:rPr>
-        <w:t>❓ DNS ne résout pas</w:t>
+        <w:t>■ DNS ne résout pas</w:t>
       </w:r>
     </w:p>
     <w:p>
+      <w:pPr>
+        <w:spacing w:after="120"/>
+      </w:pPr>
       <w:r>
-        <w:t>Vérifiez que le DNS du PC pointe vers un Serveur avec le service DNS activé.</w:t>
+        <w:rPr>
+          <w:b w:val="0"/>
+          <w:sz w:val="19"/>
+        </w:rPr>
+        <w:t>Vérifiez que l'adresse DNS du PC pointe vers un Serveur ayant le service DNS activé et que l'enregistrement du domaine est correctement configuré.</w:t>
       </w:r>
     </w:p>
     <w:p>
       <w:r>
         <w:rPr>
           <w:b/>
+          <w:color w:val="2F855A"/>
+          <w:sz w:val="21"/>
         </w:rPr>
-        <w:t>❓ DHCP échoue</w:t>
+        <w:t>■ DHCP échoue</w:t>
       </w:r>
     </w:p>
     <w:p>
+      <w:pPr>
+        <w:spacing w:after="120"/>
+      </w:pPr>
       <w:r>
-        <w:t>Assurez-vous qu'un Serveur sur le même segment LAN a le service DHCP activé.</w:t>
+        <w:rPr>
+          <w:b w:val="0"/>
+          <w:sz w:val="19"/>
+        </w:rPr>
+        <w:t>Assurez-vous qu'une Box WiFi ou un Serveur sur le même segment LAN a le service DHCP activé.</w:t>
       </w:r>
     </w:p>
     <w:p>
       <w:r>
         <w:rPr>
           <w:b/>
+          <w:color w:val="2F855A"/>
+          <w:sz w:val="21"/>
         </w:rPr>
-        <w:t>❓ L'objectif ne se valide pas</w:t>
+        <w:t>■ WiFi non connecté</w:t>
+      </w:r>
+    </w:p>
+    <w:p>
+      <w:pPr>
+        <w:spacing w:after="120"/>
+      </w:pPr>
+      <w:r>
+        <w:rPr>
+          <w:b w:val="0"/>
+          <w:sz w:val="19"/>
+        </w:rPr>
+        <w:t>Vérifiez que le SSID de la Box WiFi correspond à ce qui est attendu, et qu'une liaison WiFi relie votre appareil à la Box.</w:t>
       </w:r>
     </w:p>
     <w:p>
       <w:r>
-        <w:t>Relisez l'intitulé et recommencez l'action. Certains objectifs nécessitent le bouton Vérifier.</w:t>
+        <w:rPr>
+          <w:b/>
+          <w:color w:val="2F855A"/>
+          <w:sz w:val="21"/>
+        </w:rPr>
+        <w:t>■ L'objectif ne se valide pas</w:t>
+      </w:r>
+    </w:p>
+    <w:p>
+      <w:pPr>
+        <w:spacing w:after="120"/>
+      </w:pPr>
+      <w:r>
+        <w:rPr>
+          <w:b w:val="0"/>
+          <w:sz w:val="19"/>
+        </w:rPr>
+        <w:t>Relisez l'intitulé et vérifiez chaque paramètre (IP, masque, passerelle, DNS). Pour les objectifs de simulation (ping, dns, http), effectuez la commande correspondante dans le terminal.</w:t>
       </w:r>
     </w:p>
     <w:sectPr>
       <w:pgSz w:w="12240" w:h="15840"/>
-      <w:pgMar w:top="1440" w:right="1800" w:bottom="1440" w:left="1800" w:header="720" w:footer="720" w:gutter="0"/>
+      <w:pgMar w:top="1134" w:right="1417" w:bottom="1134" w:left="1417" w:header="720" w:footer="720" w:gutter="0"/>
       <w:cols w:space="720"/>
       <w:docGrid w:linePitch="360"/>
     </w:sectPr>
@@ -1487,7 +2352,7 @@
     <w:qFormat/>
     <w:rsid w:val="00FC693F"/>
     <w:rPr>
-      <w:rFonts w:ascii="Arial" w:hAnsi="Arial"/>
+      <w:rFonts w:ascii="Calibri" w:hAnsi="Calibri"/>
       <w:sz w:val="20"/>
     </w:rPr>
   </w:style>

</xml_diff>